<commit_message>
Phase 1: add workbook GUID + filename fingerprint groundwork (no runtime storage yet)
What was done before: JumpTo used a per-user column model in the VeryHidden settings sheet, with no workbook-level identity and no filename fingerprint; the settings sheet was created as VeryHidden but existing sheets weren’t re-hidden if made visible.
What was done now: Enforce settings sheet VeryHidden invariant; reserve A1:B2 for JumpTo workbook identity; generate/store workbook GUID if missing; store/read =CELL("filename"); expose getWorkbookIdentity() for later phases.
</commit_message>
<xml_diff>
--- a/LPD.docx
+++ b/LPD.docx
@@ -14,12 +14,12 @@
     </w:p>
     <w:p>
       <w:r>
-        <w:t>Version note: Structural reorganization only (no new decisions).</w:t>
+        <w:t>Version note: Updated with persistence/identity decisions (Phase 1 groundwork).</w:t>
       </w:r>
     </w:p>
     <w:p>
       <w:r>
-        <w:t>Last updated: 2026-01-28</w:t>
+        <w:t>Last updated: 2026-01-30</w:t>
       </w:r>
     </w:p>
     <w:p>
@@ -486,6 +486,218 @@
     <w:p>
       <w:r>
         <w:t>This document must be updated whenever a significant architectural, behavioral, workflow, or product-direction decision is made. Minor implementation details do not require updates.</w:t>
+      </w:r>
+    </w:p>
+    <w:p>
+      <w:r>
+        <w:t>14. Persistence &amp; Identity Model (Addendum)</w:t>
+      </w:r>
+    </w:p>
+    <w:p>
+      <w:r>
+        <w:t>Decision — Dual-Path Persistence with Runtime Safety Net</w:t>
+      </w:r>
+    </w:p>
+    <w:p>
+      <w:r>
+        <w:t>Decision  JumpTo persists Favorites and Settings using a dual-path model: • Primary, portable store: Workbook VeryHidden JumpTo sheet • Secondary, durable safety net: OfficeRuntime.storage. Runtime storage is used as a safety net and fast-load source, not as the authoritative workbook store.</w:t>
+      </w:r>
+    </w:p>
+    <w:p>
+      <w:r>
+        <w:t>Rationale  Excel programmatic writes do not reliably mark workbooks as dirty. As a result, JumpTo state written to the workbook may be silently discarded if the user closes without saving. Dual-path persistence prevents silent data loss while preserving a workbook-centric mental model.</w:t>
+      </w:r>
+    </w:p>
+    <w:p>
+      <w:r>
+        <w:t>Implications  JumpTo must reconcile between two copies of the same logical state. Runtime storage must be bounded and self-cleaning. No silent workbook saves are ever performed.</w:t>
+      </w:r>
+    </w:p>
+    <w:p>
+      <w:r>
+        <w:t>Revisit Conditions  If Excel save semantics become reliable or Office.js provides explicit dirty/save guarantees.</w:t>
+      </w:r>
+    </w:p>
+    <w:p/>
+    <w:p>
+      <w:r>
+        <w:t>Decision — Runtime Sync Gating via Workbook Identity</w:t>
+      </w:r>
+    </w:p>
+    <w:p>
+      <w:r>
+        <w:t>Decision  Synchronization with OfficeRuntime.storage is permitted only if both: 1) A JumpTo workbook GUID matches, and 2) A filename fingerprint matches. The filename fingerprint is obtained from a workbook cell containing =CELL("filename"). If either value differs, JumpTo treats the workbook as new for runtime purposes, starts a fresh runtime cache, and does not wipe workbook-stored Favorites or Settings.</w:t>
+      </w:r>
+    </w:p>
+    <w:p>
+      <w:r>
+        <w:t>Rationale  This prevents cross-contamination when users duplicate workbooks (Explorer copy, Save As) while avoiding fragile host-specific file-identity APIs. The model is explicitly a safety net, not a guarantee under all edge cases.</w:t>
+      </w:r>
+    </w:p>
+    <w:p>
+      <w:r>
+        <w:t>Implications  Rename/move or URL churn may temporarily disable the runtime safety net. Workbook data remains authoritative and intact. Runtime entries may be orphaned but are bounded by LRU eviction.</w:t>
+      </w:r>
+    </w:p>
+    <w:p>
+      <w:r>
+        <w:t>Revisit Conditions  If Office.js exposes a stable, portable workbook identity.</w:t>
+      </w:r>
+    </w:p>
+    <w:p/>
+    <w:p>
+      <w:r>
+        <w:t>Decision — Workbook GUID Ownership</w:t>
+      </w:r>
+    </w:p>
+    <w:p>
+      <w:r>
+        <w:t>Decision  JumpTo generates and owns a workbook GUID, stored in the VeryHidden JumpTo sheet. Rules: If the GUID is missing for any reason (first run or recovery), generate one. The GUID is written best-effort to the workbook. The GUID is used immediately in runtime logic, regardless of workbook save state.</w:t>
+      </w:r>
+    </w:p>
+    <w:p>
+      <w:r>
+        <w:t>Rationale  Office.js does not expose a stable workbook identifier. An application-owned GUID provides deterministic identity under JumpTo’s control.</w:t>
+      </w:r>
+    </w:p>
+    <w:p>
+      <w:r>
+        <w:t>Implications  GUID persistence depends on the workbook eventually being saved. Runtime storage provides continuity until that occurs.</w:t>
+      </w:r>
+    </w:p>
+    <w:p>
+      <w:r>
+        <w:t>Revisit Conditions  If a stable workbook identifier becomes available from the host.</w:t>
+      </w:r>
+    </w:p>
+    <w:p/>
+    <w:p>
+      <w:r>
+        <w:t>Decision — Conflict Resolution Between Stores</w:t>
+      </w:r>
+    </w:p>
+    <w:p>
+      <w:r>
+        <w:t>Decision  On dialog open, when workbook and runtime copies disagree: 1) If one copy is invalid/unparseable, take the other. 2) If both valid, take the one with the later dts timestamp. 3) If timestamps are equal or within ±4 seconds, prefer the workbook copy.</w:t>
+      </w:r>
+    </w:p>
+    <w:p>
+      <w:r>
+        <w:t>Rationale  Ensures deterministic reconciliation while biasing toward workbook-portable state in ambiguous cases.</w:t>
+      </w:r>
+    </w:p>
+    <w:p>
+      <w:r>
+        <w:t>Implications  All persisted payloads must include a dts field. Timestamp resolution tolerance must be implemented explicitly.</w:t>
+      </w:r>
+    </w:p>
+    <w:p>
+      <w:r>
+        <w:t>Revisit Conditions  If reconciliation anomalies are observed in the field.</w:t>
+      </w:r>
+    </w:p>
+    <w:p/>
+    <w:p>
+      <w:r>
+        <w:t>Decision — Background Self-Heal</w:t>
+      </w:r>
+    </w:p>
+    <w:p>
+      <w:r>
+        <w:t>Decision  After reconciliation, JumpTo performs best-effort, asynchronous self-healing: the chosen winning state is written back to the other store. Self-heal never blocks UI rendering or sheet activation.</w:t>
+      </w:r>
+    </w:p>
+    <w:p>
+      <w:r>
+        <w:t>Rationale  Allows the system to converge quickly without re-introducing interaction latency.</w:t>
+      </w:r>
+    </w:p>
+    <w:p>
+      <w:r>
+        <w:t>Implications  Extra background writes may occur. Failures are tolerated and retried on natural save events.</w:t>
+      </w:r>
+    </w:p>
+    <w:p>
+      <w:r>
+        <w:t>Revisit Conditions  If background writes prove unreliable or introduce regressions.</w:t>
+      </w:r>
+    </w:p>
+    <w:p/>
+    <w:p>
+      <w:r>
+        <w:t>Decision — Runtime Storage Bounds</w:t>
+      </w:r>
+    </w:p>
+    <w:p>
+      <w:r>
+        <w:t>Decision  OfficeRuntime.storage is explicitly bounded using LRU eviction: LRU-10 bucket: Favorites + Settings (safety net). LRU-3 bucket: Performance caches only (e.g., visible worksheet list, Recents). Buckets are independent; eviction in one does not affect the other.</w:t>
+      </w:r>
+    </w:p>
+    <w:p>
+      <w:r>
+        <w:t>Rationale  Separates durability concerns from performance optimization, keeps storage predictable, and prevents garbage accumulation.</w:t>
+      </w:r>
+    </w:p>
+    <w:p>
+      <w:r>
+        <w:t>Implications  Runtime storage must maintain LRU metadata. Performance caches are explicitly allowed to be stale.</w:t>
+      </w:r>
+    </w:p>
+    <w:p>
+      <w:r>
+        <w:t>Revisit Conditions  If storage limits or performance characteristics change.</w:t>
+      </w:r>
+    </w:p>
+    <w:p/>
+    <w:p>
+      <w:r>
+        <w:t>Decision — Startup UX Contract</w:t>
+      </w:r>
+    </w:p>
+    <w:p>
+      <w:r>
+        <w:t>Decision  JumpTo follows a fast-first render model: initial UI is rendered immediately from runtime storage (when available). Workbook reconciliation occurs in the background. If a mismatch is found, the UI is quietly corrected immediately.</w:t>
+      </w:r>
+    </w:p>
+    <w:p>
+      <w:r>
+        <w:t>Rationale  Reduces perceived startup lag while preserving correctness.</w:t>
+      </w:r>
+    </w:p>
+    <w:p>
+      <w:r>
+        <w:t>Implications  UI may update shortly after initial render. No blocking on Excel I/O for first meaningful paint.</w:t>
+      </w:r>
+    </w:p>
+    <w:p>
+      <w:r>
+        <w:t>Revisit Conditions  If users report confusion from silent corrections.</w:t>
+      </w:r>
+    </w:p>
+    <w:p/>
+    <w:p>
+      <w:r>
+        <w:t>Explicit Rejection — Restore Defaults / Reset Identity UI</w:t>
+      </w:r>
+    </w:p>
+    <w:p>
+      <w:r>
+        <w:t>Decision  JumpTo will not expose a user-facing Restore Defaults or Reset Identity control at this time.</w:t>
+      </w:r>
+    </w:p>
+    <w:p>
+      <w:r>
+        <w:t>Rationale  Identity divergence is handled implicitly via GUID + filename gating and bounded runtime caches. Additional UI would introduce complexity disproportionate to benefit.</w:t>
+      </w:r>
+    </w:p>
+    <w:p>
+      <w:r>
+        <w:t>Implications  Identity resets occur only implicitly. No manual override is provided.</w:t>
+      </w:r>
+    </w:p>
+    <w:p>
+      <w:r>
+        <w:t>Revisit Conditions  If user feedback indicates a need for explicit control.</w:t>
       </w:r>
     </w:p>
     <w:sectPr>

</xml_diff>

<commit_message>
Phase 4: add RT3 LRU cache + fast-first state; raise MAX_FAVORITES to 50
What was done before: Phases 1–3 provided workbook identity, RT10 safety-net persistence for favorites/settings with dts reconciliation + self-heal; worksheet enumeration and inventory sync still occurred before first state render; Favorites cap was 20 in two places.
What was done now: Added RT3 LRU-3 perf cache for visible worksheet list + recents; added getJumpToState({ preferCache: true }) fast path; commands now emits cache-backed state first then full refresh; raised MAX_FAVORITES to 50 consistently and updated LPD.
</commit_message>
<xml_diff>
--- a/LPD.docx
+++ b/LPD.docx
@@ -14,12 +14,12 @@
     </w:p>
     <w:p>
       <w:r>
-        <w:t>Version note: Updated with persistence/identity decisions (Phase 1 groundwork).</w:t>
+        <w:t>Version note: Structural reorganization only (no new decisions).</w:t>
       </w:r>
     </w:p>
     <w:p>
       <w:r>
-        <w:t>Last updated: 2026-01-30</w:t>
+        <w:t>Last updated: 2026-01-28</w:t>
       </w:r>
     </w:p>
     <w:p>
@@ -490,214 +490,54 @@
     </w:p>
     <w:p>
       <w:r>
-        <w:t>14. Persistence &amp; Identity Model (Addendum)</w:t>
+        <w:br w:type="page"/>
+      </w:r>
+    </w:p>
+    <w:p>
+      <w:pPr>
+        <w:pStyle w:val="Heading2"/>
+      </w:pPr>
+      <w:r>
+        <w:t>Update — Phase 4 Performance Cache and Favorites Cap</w:t>
       </w:r>
     </w:p>
     <w:p>
       <w:r>
-        <w:t>Decision — Dual-Path Persistence with Runtime Safety Net</w:t>
+        <w:rPr>
+          <w:b/>
+        </w:rPr>
+        <w:t>Decision — MAX_FAVORITES = 50</w:t>
       </w:r>
     </w:p>
     <w:p>
       <w:r>
-        <w:t>Decision  JumpTo persists Favorites and Settings using a dual-path model: • Primary, portable store: Workbook VeryHidden JumpTo sheet • Secondary, durable safety net: OfficeRuntime.storage. Runtime storage is used as a safety net and fast-load source, not as the authoritative workbook store.</w:t>
+        <w:t>JumpTo hard-caps Favorites at 50 to bound payload size and storage usage while remaining practical for users.</w:t>
       </w:r>
     </w:p>
     <w:p>
       <w:r>
-        <w:t>Rationale  Excel programmatic writes do not reliably mark workbooks as dirty. As a result, JumpTo state written to the workbook may be silently discarded if the user closes without saving. Dual-path persistence prevents silent data loss while preserving a workbook-centric mental model.</w:t>
+        <w:rPr>
+          <w:b/>
+        </w:rPr>
+        <w:t>Decision — Phase 4 LRU-3 performance cache</w:t>
       </w:r>
     </w:p>
     <w:p>
       <w:r>
-        <w:t>Implications  JumpTo must reconcile between two copies of the same logical state. Runtime storage must be bounded and self-cleaning. No silent workbook saves are ever performed.</w:t>
+        <w:t>Implement an OfficeRuntime.storage LRU-3 bucket for performance caches (visible worksheet list and recents). Cache is allowed to be stale and is never authoritative; it is used for fast-first rendering, with background reconciliation and immediate correction if needed.</w:t>
       </w:r>
     </w:p>
     <w:p>
       <w:r>
-        <w:t>Revisit Conditions  If Excel save semantics become reliable or Office.js provides explicit dirty/save guarantees.</w:t>
-      </w:r>
-    </w:p>
-    <w:p/>
-    <w:p>
-      <w:r>
-        <w:t>Decision — Runtime Sync Gating via Workbook Identity</w:t>
+        <w:rPr>
+          <w:b/>
+        </w:rPr>
+        <w:t>Implementation note</w:t>
       </w:r>
     </w:p>
     <w:p>
       <w:r>
-        <w:t>Decision  Synchronization with OfficeRuntime.storage is permitted only if both: 1) A JumpTo workbook GUID matches, and 2) A filename fingerprint matches. The filename fingerprint is obtained from a workbook cell containing =CELL("filename"). If either value differs, JumpTo treats the workbook as new for runtime purposes, starts a fresh runtime cache, and does not wipe workbook-stored Favorites or Settings.</w:t>
-      </w:r>
-    </w:p>
-    <w:p>
-      <w:r>
-        <w:t>Rationale  This prevents cross-contamination when users duplicate workbooks (Explorer copy, Save As) while avoiding fragile host-specific file-identity APIs. The model is explicitly a safety net, not a guarantee under all edge cases.</w:t>
-      </w:r>
-    </w:p>
-    <w:p>
-      <w:r>
-        <w:t>Implications  Rename/move or URL churn may temporarily disable the runtime safety net. Workbook data remains authoritative and intact. Runtime entries may be orphaned but are bounded by LRU eviction.</w:t>
-      </w:r>
-    </w:p>
-    <w:p>
-      <w:r>
-        <w:t>Revisit Conditions  If Office.js exposes a stable, portable workbook identity.</w:t>
-      </w:r>
-    </w:p>
-    <w:p/>
-    <w:p>
-      <w:r>
-        <w:t>Decision — Workbook GUID Ownership</w:t>
-      </w:r>
-    </w:p>
-    <w:p>
-      <w:r>
-        <w:t>Decision  JumpTo generates and owns a workbook GUID, stored in the VeryHidden JumpTo sheet. Rules: If the GUID is missing for any reason (first run or recovery), generate one. The GUID is written best-effort to the workbook. The GUID is used immediately in runtime logic, regardless of workbook save state.</w:t>
-      </w:r>
-    </w:p>
-    <w:p>
-      <w:r>
-        <w:t>Rationale  Office.js does not expose a stable workbook identifier. An application-owned GUID provides deterministic identity under JumpTo’s control.</w:t>
-      </w:r>
-    </w:p>
-    <w:p>
-      <w:r>
-        <w:t>Implications  GUID persistence depends on the workbook eventually being saved. Runtime storage provides continuity until that occurs.</w:t>
-      </w:r>
-    </w:p>
-    <w:p>
-      <w:r>
-        <w:t>Revisit Conditions  If a stable workbook identifier becomes available from the host.</w:t>
-      </w:r>
-    </w:p>
-    <w:p/>
-    <w:p>
-      <w:r>
-        <w:t>Decision — Conflict Resolution Between Stores</w:t>
-      </w:r>
-    </w:p>
-    <w:p>
-      <w:r>
-        <w:t>Decision  On dialog open, when workbook and runtime copies disagree: 1) If one copy is invalid/unparseable, take the other. 2) If both valid, take the one with the later dts timestamp. 3) If timestamps are equal or within ±4 seconds, prefer the workbook copy.</w:t>
-      </w:r>
-    </w:p>
-    <w:p>
-      <w:r>
-        <w:t>Rationale  Ensures deterministic reconciliation while biasing toward workbook-portable state in ambiguous cases.</w:t>
-      </w:r>
-    </w:p>
-    <w:p>
-      <w:r>
-        <w:t>Implications  All persisted payloads must include a dts field. Timestamp resolution tolerance must be implemented explicitly.</w:t>
-      </w:r>
-    </w:p>
-    <w:p>
-      <w:r>
-        <w:t>Revisit Conditions  If reconciliation anomalies are observed in the field.</w:t>
-      </w:r>
-    </w:p>
-    <w:p/>
-    <w:p>
-      <w:r>
-        <w:t>Decision — Background Self-Heal</w:t>
-      </w:r>
-    </w:p>
-    <w:p>
-      <w:r>
-        <w:t>Decision  After reconciliation, JumpTo performs best-effort, asynchronous self-healing: the chosen winning state is written back to the other store. Self-heal never blocks UI rendering or sheet activation.</w:t>
-      </w:r>
-    </w:p>
-    <w:p>
-      <w:r>
-        <w:t>Rationale  Allows the system to converge quickly without re-introducing interaction latency.</w:t>
-      </w:r>
-    </w:p>
-    <w:p>
-      <w:r>
-        <w:t>Implications  Extra background writes may occur. Failures are tolerated and retried on natural save events.</w:t>
-      </w:r>
-    </w:p>
-    <w:p>
-      <w:r>
-        <w:t>Revisit Conditions  If background writes prove unreliable or introduce regressions.</w:t>
-      </w:r>
-    </w:p>
-    <w:p/>
-    <w:p>
-      <w:r>
-        <w:t>Decision — Runtime Storage Bounds</w:t>
-      </w:r>
-    </w:p>
-    <w:p>
-      <w:r>
-        <w:t>Decision  OfficeRuntime.storage is explicitly bounded using LRU eviction: LRU-10 bucket: Favorites + Settings (safety net). LRU-3 bucket: Performance caches only (e.g., visible worksheet list, Recents). Buckets are independent; eviction in one does not affect the other.</w:t>
-      </w:r>
-    </w:p>
-    <w:p>
-      <w:r>
-        <w:t>Rationale  Separates durability concerns from performance optimization, keeps storage predictable, and prevents garbage accumulation.</w:t>
-      </w:r>
-    </w:p>
-    <w:p>
-      <w:r>
-        <w:t>Implications  Runtime storage must maintain LRU metadata. Performance caches are explicitly allowed to be stale.</w:t>
-      </w:r>
-    </w:p>
-    <w:p>
-      <w:r>
-        <w:t>Revisit Conditions  If storage limits or performance characteristics change.</w:t>
-      </w:r>
-    </w:p>
-    <w:p/>
-    <w:p>
-      <w:r>
-        <w:t>Decision — Startup UX Contract</w:t>
-      </w:r>
-    </w:p>
-    <w:p>
-      <w:r>
-        <w:t>Decision  JumpTo follows a fast-first render model: initial UI is rendered immediately from runtime storage (when available). Workbook reconciliation occurs in the background. If a mismatch is found, the UI is quietly corrected immediately.</w:t>
-      </w:r>
-    </w:p>
-    <w:p>
-      <w:r>
-        <w:t>Rationale  Reduces perceived startup lag while preserving correctness.</w:t>
-      </w:r>
-    </w:p>
-    <w:p>
-      <w:r>
-        <w:t>Implications  UI may update shortly after initial render. No blocking on Excel I/O for first meaningful paint.</w:t>
-      </w:r>
-    </w:p>
-    <w:p>
-      <w:r>
-        <w:t>Revisit Conditions  If users report confusion from silent corrections.</w:t>
-      </w:r>
-    </w:p>
-    <w:p/>
-    <w:p>
-      <w:r>
-        <w:t>Explicit Rejection — Restore Defaults / Reset Identity UI</w:t>
-      </w:r>
-    </w:p>
-    <w:p>
-      <w:r>
-        <w:t>Decision  JumpTo will not expose a user-facing Restore Defaults or Reset Identity control at this time.</w:t>
-      </w:r>
-    </w:p>
-    <w:p>
-      <w:r>
-        <w:t>Rationale  Identity divergence is handled implicitly via GUID + filename gating and bounded runtime caches. Additional UI would introduce complexity disproportionate to benefit.</w:t>
-      </w:r>
-    </w:p>
-    <w:p>
-      <w:r>
-        <w:t>Implications  Identity resets occur only implicitly. No manual override is provided.</w:t>
-      </w:r>
-    </w:p>
-    <w:p>
-      <w:r>
-        <w:t>Revisit Conditions  If user feedback indicates a need for explicit control.</w:t>
+        <w:t>Commands layer prefers cache-backed state on initial dialog open, then performs a full refresh and emits an updated state if differences are detected.</w:t>
       </w:r>
     </w:p>
     <w:sectPr>

</xml_diff>

<commit_message>
feat(prefs): split dynamic state updates from UI prefs; hydrate prefs once per dialog open
What was done before:
- Parent sent stateData repeatedly; dialog applied both dynamic data and UI prefs from stateData.
- Late/stale stateData echoes could overwrite in-progress UI edits, causing slider/recents/order toggles to jump/revert.
- Base-order and bump-freq were not reliably round-tripped as UI settings.

What changed:
- UI preferences (slider, recents count, base-order, bump-freq) are now hydration-only per dialog open:
  - applied on first stateData only, then dialog-local state remains authoritative for the session.
  - parent stateData continues to update dynamic data (sheets/favorites/recents) normally.
- UI settings persistence payload now includes baselineOrder and frequentOnTop alongside existing UI settings.
- Updated LPD with the new two-channel sync contract + rationale.
</commit_message>
<xml_diff>
--- a/LPD.docx
+++ b/LPD.docx
@@ -19,7 +19,7 @@
     </w:p>
     <w:p>
       <w:r>
-        <w:t>Last updated: 2026-01-28</w:t>
+        <w:t>Last updated: 2026-01-31</w:t>
       </w:r>
     </w:p>
     <w:p>
@@ -264,44 +264,28 @@
     <w:p>
       <w:r>
         <w:t>• Excel Office.js + React + Webpack</w:t>
-      </w:r>
-      <w:r>
         <w:br/>
         <w:t>• Temporary hosting on GitHub Pages</w:t>
-      </w:r>
-      <w:r>
         <w:br/>
         <w:t>• dialog.jsx is primary UI surface</w:t>
-      </w:r>
-      <w:r>
         <w:br/>
         <w:t>• Dialog-local state authoritative</w:t>
-      </w:r>
-      <w:r>
+        <w:br/>
+        <w:t>• Two-channel sync: parent may push dynamic data updates; UI prefs hydrate once per dialog open and remain dialog-authoritative (parent echoes treated as acks) to prevent late stateData overwrites/jumping.</w:t>
         <w:br/>
         <w:t>• Debounced persistence with flush on close</w:t>
-      </w:r>
-      <w:r>
         <w:br/>
         <w:t>• Explicit focus handling for Office dialogs</w:t>
-      </w:r>
-      <w:r>
         <w:br/>
         <w:t>• Sheet selection prioritizes immediate close + activation; persistence runs in parent after close</w:t>
-      </w:r>
-      <w:r>
         <w:br/>
-      </w:r>
-      <w:r>
-        <w:lastRenderedPageBreak/>
         <w:t>• selectSheet/cancel carry a state snapshot to avoid blocking selection behind multiple flushes</w:t>
-      </w:r>
-      <w:r>
         <w:br/>
-      </w:r>
-      <w:r>
         <w:br/>
         <w:t>Rationale: Users noticed ~200ms latency when selecting a sheet; flushing debounced saves before activation created message/lock contention. Snapshot-based persistence preserves correctness without delaying the jump.</w:t>
+        <w:br/>
+        <w:br/>
+        <w:t>Additional rationale: Phase-4 reconciliation and message echo can deliver stale UI pref values after the user has already edited them in the dialog. Treating UI prefs as hydration-only during a session prevents slider/count/order toggles from "jumping" while preserving parent push updates for dynamic data (sheets/favorites/recents).</w:t>
       </w:r>
     </w:p>
     <w:p>

</xml_diff>

<commit_message>
Restore production GUI sizing + per-tab scroll + tooltips (post-Lab rollback)
</commit_message>
<xml_diff>
--- a/LPD.docx
+++ b/LPD.docx
@@ -3,56 +3,487 @@
 <w:document xmlns:wpc="http://schemas.microsoft.com/office/word/2010/wordprocessingCanvas" xmlns:mo="http://schemas.microsoft.com/office/mac/office/2008/main" xmlns:mc="http://schemas.openxmlformats.org/markup-compatibility/2006" xmlns:mv="urn:schemas-microsoft-com:mac:vml" xmlns:o="urn:schemas-microsoft-com:office:office" xmlns:r="http://schemas.openxmlformats.org/officeDocument/2006/relationships" xmlns:m="http://schemas.openxmlformats.org/officeDocument/2006/math" xmlns:v="urn:schemas-microsoft-com:vml" xmlns:wp14="http://schemas.microsoft.com/office/word/2010/wordprocessingDrawing" xmlns:wp="http://schemas.openxmlformats.org/drawingml/2006/wordprocessingDrawing" xmlns:w10="urn:schemas-microsoft-com:office:word" xmlns:w="http://schemas.openxmlformats.org/wordprocessingml/2006/main" xmlns:w14="http://schemas.microsoft.com/office/word/2010/wordml" xmlns:wpg="http://schemas.microsoft.com/office/word/2010/wordprocessingGroup" xmlns:wpi="http://schemas.microsoft.com/office/word/2010/wordprocessingInk" xmlns:wne="http://schemas.microsoft.com/office/word/2006/wordml" xmlns:wps="http://schemas.microsoft.com/office/word/2010/wordprocessingShape" mc:Ignorable="w14 wp14">
   <w:body>
     <w:p>
+      <w:r>
+        <w:t>JumpTo — Living Project Document (LPD)</w:t>
+      </w:r>
+    </w:p>
+    <w:p>
+      <w:r>
+        <w:t>Authoritative consolidated document</w:t>
+      </w:r>
+    </w:p>
+    <w:p>
+      <w:r>
+        <w:t>Version note: Structural reorganization only (no new decisions).</w:t>
+      </w:r>
+    </w:p>
+    <w:p>
+      <w:r>
+        <w:t>Last updated: 2026-01-31</w:t>
+      </w:r>
+    </w:p>
+    <w:p>
+      <w:r>
+        <w:t>1. Project Identity &amp; Design Ethos</w:t>
+      </w:r>
+    </w:p>
+    <w:p>
+      <w:r>
+        <w:t>JumpTo is an Excel navigation add-in focused on speed, clarity, and minimal interruption. Its core value is allowing users to jump between worksheets with as little friction as possible. The design ethos is inspired by classic VBA-era immediacy, implemented with modern tooling.</w:t>
+      </w:r>
+    </w:p>
+    <w:p>
+      <w:r>
+        <w:t>2. Product Scope &amp; Long‑Term Vision</w:t>
+      </w:r>
+    </w:p>
+    <w:p>
+      <w:r>
+        <w:t>JumpTo is intentionally designed with three related but distinct product forms:</w:t>
+      </w:r>
+    </w:p>
+    <w:p>
+      <w:r>
+        <w:t>Version 1 — Dialog-Based Add-in (current focus):</w:t>
+        <w:br/>
+        <w:t>• Modal dialog interaction</w:t>
+        <w:br/>
+        <w:t>• Get-in / jump / get-out workflow</w:t>
+        <w:br/>
+        <w:t>• Minimal screen real estate</w:t>
+      </w:r>
+    </w:p>
+    <w:p>
+      <w:r>
+        <w:t>Version 2 — Always-On Taskpane (planned):</w:t>
+        <w:br/>
+        <w:t>• Optional persistent UI</w:t>
+        <w:br/>
+        <w:t>• Same logic and data model as dialog</w:t>
+        <w:br/>
+        <w:t>• Offered after dialog behavior stabilizes</w:t>
+      </w:r>
+    </w:p>
+    <w:p>
+      <w:r>
+        <w:t>Version 3 — Native COM Add-in (future):</w:t>
+        <w:br/>
+        <w:t>• Separate COM add-in (likely C++)</w:t>
+        <w:br/>
+        <w:t>• Maximum responsiveness</w:t>
+        <w:br/>
+        <w:t>• Separate download</w:t>
+        <w:br/>
+        <w:t>• Free upgrade for active AppSource subscribers</w:t>
+      </w:r>
+    </w:p>
+    <w:p>
+      <w:r>
+        <w:t>3. Workflow Model &amp; Authority</w:t>
+      </w:r>
+    </w:p>
+    <w:p>
+      <w:r>
+        <w:t>Chat: Ephemeral reasoning only. Not authoritative.</w:t>
+        <w:br/>
+        <w:t>WMD (Working Memory Document): Current operational truth. Short, tactical, aggressively pruned.</w:t>
+        <w:br/>
+        <w:t>LPD (this document): Durable, authoritative record of decisions, rationale, and constraints.</w:t>
+        <w:br/>
+        <w:br/>
+        <w:t>Decisions are final only when reflected in the LPD.</w:t>
+      </w:r>
+    </w:p>
+    <w:p>
+      <w:r>
+        <w:t>4. Ownership</w:t>
+      </w:r>
+    </w:p>
+    <w:p>
+      <w:r>
+        <w:t>Assistant maintains the WMD and drafts LPD updates. User reviews, corrects, and retains final authority.</w:t>
+      </w:r>
+    </w:p>
+    <w:p>
+      <w:r>
+        <w:t>5. Workflow Rules (Locked)</w:t>
+      </w:r>
+    </w:p>
+    <w:p>
+      <w:r>
+        <w:t>5.1 Active WMD/LPD Curation (No Drift Rule)</w:t>
+        <w:br/>
+        <w:t>After each communication received from the user, the assistant must evaluate whether updates are required to the LPD. Clearly-no → no change; Clearly-yes → update immediately internally, to be included in the next package; Uncertain → raise explicitly within the same session (may be deferred to a natural pause).</w:t>
+      </w:r>
+    </w:p>
+    <w:p>
+      <w:r>
+        <w:t>Each communication should include (at the end) either a full LPD discussion when warranted, or an LPD status one-line remark. Examples: LPD: No update needed | LPD: update? Discussion deferred | LPD: updated, download pending | LPD: still pending.</w:t>
+      </w:r>
+    </w:p>
+    <w:p>
+      <w:r>
+        <w:t>On chat transfer, each WMD item must be evaluated for current relevancy. It must then either be retained, promoted to LPD, or removed.</w:t>
+      </w:r>
+    </w:p>
+    <w:p>
+      <w:r>
+        <w:t>5.2 Mandatory Project-State Expectation in WMD</w:t>
+        <w:br/>
+        <w:t>Every WMD must instruct the next instance to expect upload of the current project state (relevant source files for the next task) and the current LPD. If missing, the assistant must prompt before substantive analysis, design, or code changes.</w:t>
+      </w:r>
+    </w:p>
+    <w:p>
+      <w:r>
+        <w:t>5.3 Workflow instructions in WMD</w:t>
+      </w:r>
+    </w:p>
+    <w:p>
+      <w:r>
+        <w:t>Every WMD must include a copy of the section(s) of the LPD which deal with workflow. This includes the section on Patch Delivery Rules. (At the time of this writing these are sections 5 and 6. Should this change, the assistant is authorized and mandated to update these references).</w:t>
+      </w:r>
+    </w:p>
+    <w:p>
+      <w:r>
+        <w:t>6. Patch Delivery Rules (Locked)</w:t>
+      </w:r>
+    </w:p>
+    <w:p>
+      <w:r>
+        <w:t>• Patches must be whole-file replacements or clean diffs.</w:t>
+        <w:br/>
+        <w:t>• Include a commit message stating "what was done before".</w:t>
+        <w:br/>
+        <w:t>• Include only changed files.</w:t>
+        <w:br/>
+        <w:t>• Manual editing rejected except trivial mechanical fixes.</w:t>
+        <w:br/>
+        <w:t>• Include updated LPD when decisions are affected.</w:t>
+        <w:br/>
+        <w:t>• Mandatory syntax preflight: {}, (), [], JSX tags.</w:t>
+      </w:r>
+    </w:p>
+    <w:p>
+      <w:r>
+        <w:t>• Include in the chat a confirmation that the syntax preflight was performed.</w:t>
+      </w:r>
+    </w:p>
+    <w:p>
+      <w:r>
+        <w:t>7. Architecture Snapshot</w:t>
+      </w:r>
+    </w:p>
+    <w:p>
+      <w:r>
+        <w:t>• Excel Office.js + React + Webpack</w:t>
+        <w:br/>
+        <w:t>• Temporary hosting on GitHub Pages</w:t>
+        <w:br/>
+        <w:t>• dialog.jsx is primary UI surface</w:t>
+        <w:br/>
+        <w:t>• Dialog-local state authoritative</w:t>
+        <w:br/>
+        <w:t>• Two-channel sync: parent may push dynamic data updates; UI prefs hydrate once per dialog open and remain dialog-authoritative (parent echoes treated as acks) to prevent late stateData overwrites/jumping.</w:t>
+        <w:br/>
+        <w:t>• Debounced persistence with flush on close</w:t>
+        <w:br/>
+        <w:t>• Explicit focus handling for Office dialogs</w:t>
+        <w:br/>
+        <w:t>• Sheet selection prioritizes immediate close + activation; persistence runs in parent after close</w:t>
+        <w:br/>
+        <w:t>• selectSheet/cancel carry a state snapshot to avoid blocking selection behind multiple flushes</w:t>
+        <w:br/>
+        <w:br/>
+        <w:t>Rationale: Users noticed ~200ms latency when selecting a sheet; flushing debounced saves before activation created message/lock contention. Snapshot-based persistence preserves correctness without delaying the jump.</w:t>
+        <w:br/>
+        <w:br/>
+        <w:t>Additional rationale: Phase-4 reconciliation and message echo can deliver stale UI pref values after the user has already edited them in the dialog. Treating UI prefs as hydration-only during a session prevents slider/count/order toggles from "jumping" while preserving parent push updates for dynamic data (sheets/favorites/recents).</w:t>
+      </w:r>
+    </w:p>
+    <w:p>
+      <w:r>
+        <w:t>8. UI / UX Decisions (Locked)</w:t>
+      </w:r>
+    </w:p>
+    <w:p>
+      <w:r>
+        <w:t>• Favorites and Recents on Navigation tab</w:t>
+        <w:br/>
+        <w:t>• Favorites tab is configuration only</w:t>
+        <w:br/>
+        <w:t>• No dialog scrolling on Navigation/Favorites; internal list scrolling only</w:t>
+        <w:br/>
+        <w:t>• Settings tab may scroll</w:t>
+        <w:br/>
+        <w:t>• Row height presets: Compact / Standard / Comfortable / Expanded</w:t>
+        <w:br/>
+        <w:t>• Compact: { fontSize: 10, lineHeight: 15, paddingY: 1 }</w:t>
+        <w:br/>
+        <w:t>• Standard remains default</w:t>
+        <w:br/>
+        <w:t>• Presets apply globally</w:t>
+      </w:r>
+    </w:p>
+    <w:p>
+      <w:r>
+        <w:t>9. Space Allocation Rules (Locked)</w:t>
+      </w:r>
+    </w:p>
+    <w:p>
+      <w:r>
+        <w:t>• Single slider governs Favorites/Recents space (20%–80%)</w:t>
+        <w:br/>
+        <w:t>• Surplus space donated to the other list</w:t>
+        <w:br/>
+        <w:t>• Slider label: "When space is limited, give more room to:"</w:t>
+        <w:br/>
+        <w:t>• "Prioritize Favorites" removed as redundant</w:t>
+      </w:r>
+    </w:p>
+    <w:p>
+      <w:r>
+        <w:t>10. Behavioral Rules (Locked)</w:t>
+      </w:r>
+    </w:p>
+    <w:p>
+      <w:r>
+        <w:t>Recents:</w:t>
+        <w:br/>
+        <w:t>• Stored as bounded history (MAX_RECENTS)</w:t>
+        <w:br/>
+        <w:t>• Active sheet excluded</w:t>
+        <w:br/>
+        <w:t>• Non-visible sheets excluded</w:t>
+        <w:br/>
+        <w:t>• After filtering, take N most recent where N is user-selected</w:t>
+        <w:br/>
+        <w:br/>
+        <w:t>Favorites:</w:t>
+        <w:br/>
+        <w:t>• Stored by worksheet ID</w:t>
+        <w:br/>
+        <w:t>• Newly added favorites auto-highlighted and scrolled into view</w:t>
+        <w:br/>
+        <w:t>• Favorites tab right column uses 70% listbox / 30% controls split</w:t>
+      </w:r>
+    </w:p>
+    <w:p>
+      <w:r>
+        <w:t>One-digit activation:</w:t>
+      </w:r>
+    </w:p>
+    <w:p>
+      <w:r>
+        <w:t>• Default: ON.</w:t>
+      </w:r>
+    </w:p>
+    <w:p>
+      <w:r>
+        <w:t>• When enabled: typing a single digit (1–9, 0) as the first character triggers immediate activation (before multi-digit input is possible).</w:t>
+      </w:r>
+    </w:p>
+    <w:p>
+      <w:r>
+        <w:t>• To search for a number that starts with a digit (e.g. 2024), start the search with a leading space.</w:t>
+      </w:r>
+    </w:p>
+    <w:p>
+      <w:r>
+        <w:t>• Exposed as a Settings-tab checkbox that toggles the behavior on/off.</w:t>
+      </w:r>
+    </w:p>
+    <w:p>
+      <w:r>
+        <w:t>11. Pitfalls &amp; Lessons Learned</w:t>
+      </w:r>
+    </w:p>
+    <w:p>
+      <w:r>
+        <w:t>• Nested hooks cause Invalid Hook Call (#321)</w:t>
+        <w:br/>
+        <w:t>• Long components require structural discipline</w:t>
+        <w:br/>
+        <w:t>• Office dialog webviews may report less space than computed</w:t>
+      </w:r>
+    </w:p>
+    <w:p>
+      <w:r>
+        <w:t>12. Decision Log Rule</w:t>
+      </w:r>
+    </w:p>
+    <w:p>
+      <w:r>
+        <w:t>Every non-trivial decision must be recorded using:</w:t>
+        <w:br/>
+        <w:t>Decision • Rationale • Implications • Revisit Conditions</w:t>
+      </w:r>
+    </w:p>
+    <w:p>
+      <w:r>
+        <w:t>Decision • One-digit activation is default ON, with a Settings toggle; numeric searches start with a leading space.  Rationale • Preserve VBA-era immediacy while keeping numeric searches possible.  Implications • Users must learn the space-prefix convention; UI must surface the tip next to the toggle.  Revisit Conditions • If users report confusion or accidental activation, revisit trigger rules and/or add onboarding.</w:t>
+      </w:r>
+    </w:p>
+    <w:p>
+      <w:r>
+        <w:t>13. Maintenance Rule</w:t>
+      </w:r>
+    </w:p>
+    <w:p>
+      <w:r>
+        <w:t>This document must be updated whenever a significant architectural, behavioral, workflow, or product-direction decision is made. Minor implementation details do not require updates.</w:t>
+      </w:r>
+    </w:p>
+    <w:p/>
+    <w:p>
+      <w:r>
+        <w:t>Update — Phase 4 Performance Cache and Favorites Cap</w:t>
+      </w:r>
+    </w:p>
+    <w:p>
+      <w:r>
+        <w:t>Decision — MAX_FAVORITES = 50</w:t>
+      </w:r>
+    </w:p>
+    <w:p>
+      <w:r>
+        <w:t>JumpTo hard-caps Favorites at 50 to bound payload size and storage usage while remaining practical for users.</w:t>
+      </w:r>
+    </w:p>
+    <w:p>
+      <w:r>
+        <w:t>Decision — Phase 4 LRU-3 performance cache</w:t>
+      </w:r>
+    </w:p>
+    <w:p>
+      <w:r>
+        <w:t>Implement an OfficeRuntime.storage LRU-3 bucket for performance caches (visible worksheet list and recents). Cache is allowed to be stale and is never authoritative; it is used for fast-first rendering, with background reconciliation and immediate correction if needed.</w:t>
+      </w:r>
+    </w:p>
+    <w:p>
+      <w:r>
+        <w:t>Implementation note</w:t>
+      </w:r>
+    </w:p>
+    <w:p>
+      <w:r>
+        <w:t>Commands layer prefers cache-backed state on initial dialog open, then performs a full refresh and emits an updated state if differences are detected.</w:t>
+      </w:r>
+    </w:p>
+    <w:p>
+      <w:r>
+        <w:br w:type="page"/>
+      </w:r>
+    </w:p>
+    <w:p>
       <w:pPr>
         <w:pStyle w:val="Heading1"/>
       </w:pPr>
       <w:r>
-        <w:t>LPD — JumpTo (Excerpt Update)</w:t>
+        <w:t>Dialog Layout and Sizing Rules</w:t>
       </w:r>
     </w:p>
     <w:p>
       <w:r>
-        <w:t>Decision: Frequency-based bumping of search results is supported.</w:t>
+        <w:t>The dialog operates under two horizontal layout regimes.</w:t>
         <w:br/>
         <w:br/>
-        <w:t>Summary:</w:t>
+        <w:t>Non-scroll regime:</w:t>
         <w:br/>
-        <w:t>When the user performs a search that narrows the full worksheet list, the UI may optionally reorder a small number of the most frequently used sheets to the top of the results.</w:t>
+        <w:t>- No horizontal scrollbar is present.</w:t>
+        <w:br/>
+        <w:t>- Layout expands fluidly to fill available dialog width (minus margins).</w:t>
+        <w:br/>
+        <w:t>- Min-width values act strictly as floors and are never targets.</w:t>
+        <w:br/>
+        <w:t>- No optimum width is applied in this regime.</w:t>
         <w:br/>
         <w:br/>
-        <w:t>What is fixed (policy-level):</w:t>
+        <w:t>Scroll regime:</w:t>
         <w:br/>
-        <w:t>• Applies only when a search query is non-empty and results are a strict subset.</w:t>
+        <w:t>- Horizontal overflow is detected for the active tab.</w:t>
         <w:br/>
-        <w:t>• Uses the worksheet frequency table (not recents).</w:t>
+        <w:t>- Layout switches from responsive compression to readability preservation.</w:t>
         <w:br/>
-        <w:t>• Does not reorder the full list.</w:t>
+        <w:t>- Widths snap to predefined optimum values.</w:t>
         <w:br/>
-        <w:t>• Uses a median-based baseline to avoid skew.</w:t>
-        <w:br/>
-        <w:t>• Enforces an absolute floor to prevent trivial bumps.</w:t>
-        <w:br/>
-        <w:t>• Caps the total number of bumped items (≤ 5).</w:t>
-        <w:br/>
-        <w:t>• Bumped items are sorted by frequency (desc), then base order.</w:t>
+        <w:t>- Further dialog narrowing results in horizontal scrolling, not further compression.</w:t>
+      </w:r>
+    </w:p>
+    <w:p>
+      <w:pPr>
+        <w:pStyle w:val="Heading1"/>
+      </w:pPr>
+      <w:r>
+        <w:t>Navigation and Favorites Layout</w:t>
+      </w:r>
+    </w:p>
+    <w:p>
+      <w:r>
+        <w:t>Navigation and Favorites share a single layout specification.</w:t>
         <w:br/>
         <w:br/>
-        <w:t>What is intentionally NOT fixed (implementation detail):</w:t>
+        <w:t>- Identical four-column grid.</w:t>
         <w:br/>
-        <w:t>• Exact threshold constants (ratios, floors).</w:t>
+        <w:t>- Identical width rules, margins, and scroll behavior.</w:t>
         <w:br/>
-        <w:t>• Exact candidate selection math.</w:t>
+        <w:t>- Switching between Navigation and Favorites does not alter layout geometry.</w:t>
         <w:br/>
         <w:br/>
-        <w:t>Rationale:</w:t>
+        <w:t>Column width semantics:</w:t>
         <w:br/>
-        <w:t>The goal is to surface a small number of clearly dominant sheets without introducing surprise reordering or overfitting to specific distributions. Threshold tuning may evolve based on observed real-world data without changing the conceptual model.</w:t>
+        <w:t>- Minimum column width: 200px (hard floor only).</w:t>
+        <w:br/>
+        <w:t>- Fluid width: columns expand proportionally in non-scroll regime.</w:t>
+        <w:br/>
+        <w:t>- Optimum column width (scroll regime only): 280px per column.</w:t>
+      </w:r>
+    </w:p>
+    <w:p>
+      <w:pPr>
+        <w:pStyle w:val="Heading1"/>
+      </w:pPr>
+      <w:r>
+        <w:t>Settings Layout Rules</w:t>
+      </w:r>
+    </w:p>
+    <w:p>
+      <w:r>
+        <w:t>- Minimum Settings width: 390px.</w:t>
+        <w:br/>
+        <w:t>- Optimum Settings width (scroll regime only): 520px.</w:t>
         <w:br/>
         <w:br/>
-        <w:t>Status:</w:t>
+        <w:t>Settings follows the same two-regime model as Navigation and Favorites, applied to a single container.</w:t>
+      </w:r>
+    </w:p>
+    <w:p>
+      <w:pPr>
+        <w:pStyle w:val="Heading1"/>
+      </w:pPr>
+      <w:r>
+        <w:t>Horizontal Scrolling Policy</w:t>
+      </w:r>
+    </w:p>
+    <w:p>
+      <w:r>
+        <w:t>- Horizontal scrolling is scoped per tab.</w:t>
         <w:br/>
-        <w:t>Behavioral model is considered stable. Numeric tuning parameters may be adjusted without revisiting this decision.</w:t>
+        <w:t>- Scrollbars appear only when that tab’s content exceeds available width.</w:t>
         <w:br/>
+        <w:t>- Horizontal scrolling is an intentional and acceptable UX outcome.</w:t>
+      </w:r>
+    </w:p>
+    <w:p>
+      <w:pPr>
+        <w:pStyle w:val="Heading1"/>
+      </w:pPr>
+      <w:r>
+        <w:t>Overflow Discoverability</w:t>
+      </w:r>
+    </w:p>
+    <w:p>
+      <w:r>
+        <w:t>Any text truncated via ellipsis must expose its full content through a hover affordance.</w:t>
       </w:r>
     </w:p>
     <w:sectPr>

</xml_diff>

<commit_message>
Unify per-user identity key across Taskpane and storage layer
Taskpane was using a different user identity storage key
("JumpToAddin.UserKey") than the core persistence layer
("JumpTo.UserKey"), causing multiple user IDs to be generated
for the same person and leading to apparent loss of Favorites
and Settings in shared workbooks.

This change makes the Taskpane use the same per-user identity
key and worksheet row layout as jumpToStorage, ensuring a
single stable identity per user/device and consistent
Favorites/Recents/Settings persistence across entrypoints.

No functional behavior change intended beyond eliminating
identity churn.
</commit_message>
<xml_diff>
--- a/LPD.docx
+++ b/LPD.docx
@@ -663,6 +663,155 @@
     <w:p>
       <w:r>
         <w:t>This is a random change to jumpstart a deployment.</w:t>
+      </w:r>
+    </w:p>
+    <w:p>
+      <w:r>
+        <w:br w:type="page"/>
+      </w:r>
+    </w:p>
+    <w:p>
+      <w:pPr>
+        <w:pStyle w:val="Heading1"/>
+      </w:pPr>
+      <w:r>
+        <w:t>Licensing &amp; Activation Policy (Locked)</w:t>
+      </w:r>
+    </w:p>
+    <w:p>
+      <w:r>
+        <w:t>JumpTo is sold as a one-time purchase for individual use. AppSource is an optional distribution channel, not a governing constraint on licensing design.</w:t>
+      </w:r>
+    </w:p>
+    <w:p/>
+    <w:p>
+      <w:r>
+        <w:t>License Scope</w:t>
+      </w:r>
+    </w:p>
+    <w:p>
+      <w:r>
+        <w:t>• One license is intended for use by one person.</w:t>
+      </w:r>
+    </w:p>
+    <w:p>
+      <w:r>
+        <w:t>• A license may be used on up to two active computers at a time.</w:t>
+      </w:r>
+    </w:p>
+    <w:p>
+      <w:r>
+        <w:t>• Sequential use across computers is permitted.</w:t>
+      </w:r>
+    </w:p>
+    <w:p/>
+    <w:p>
+      <w:r>
+        <w:t>Definition of Active Computer (Model A)</w:t>
+      </w:r>
+    </w:p>
+    <w:p>
+      <w:r>
+        <w:t>• An active computer is one that has been recently observed by the licensing service.</w:t>
+      </w:r>
+    </w:p>
+    <w:p>
+      <w:r>
+        <w:t>• Offline computers are never disabled solely due to lack of connectivity.</w:t>
+      </w:r>
+    </w:p>
+    <w:p>
+      <w:r>
+        <w:t>• Computers that have not checked in for an extended period automatically stop counting as active.</w:t>
+      </w:r>
+    </w:p>
+    <w:p/>
+    <w:p>
+      <w:r>
+        <w:t>Device Switching</w:t>
+      </w:r>
+    </w:p>
+    <w:p>
+      <w:r>
+        <w:t>• A switch occurs only when a new computer is admitted while both active slots are already occupied, causing one existing active computer to be replaced.</w:t>
+      </w:r>
+    </w:p>
+    <w:p>
+      <w:r>
+        <w:t>• Filling an empty slot does not count as a switch.</w:t>
+      </w:r>
+    </w:p>
+    <w:p>
+      <w:r>
+        <w:t>• Automatic expiration of inactive computers does not count as a switch.</w:t>
+      </w:r>
+    </w:p>
+    <w:p/>
+    <w:p>
+      <w:r>
+        <w:t>Switch Rate Limiting</w:t>
+      </w:r>
+    </w:p>
+    <w:p>
+      <w:r>
+        <w:t>• Licenses allow a limited number of free switches.</w:t>
+      </w:r>
+    </w:p>
+    <w:p>
+      <w:r>
+        <w:t>• If five or more switches occur within any rolling 30-day window, the license enters a restricted state.</w:t>
+      </w:r>
+    </w:p>
+    <w:p>
+      <w:r>
+        <w:t>• While restricted, at most one switch is permitted per 7-day period.</w:t>
+      </w:r>
+    </w:p>
+    <w:p>
+      <w:r>
+        <w:t>• The restricted state persists until a full 30-day period passes with zero switches.</w:t>
+      </w:r>
+    </w:p>
+    <w:p/>
+    <w:p>
+      <w:r>
+        <w:t>Conflict Resolution</w:t>
+      </w:r>
+    </w:p>
+    <w:p>
+      <w:r>
+        <w:t>• When a third computer attempts to activate, the user is offered the option to switch activation to the current computer.</w:t>
+      </w:r>
+    </w:p>
+    <w:p>
+      <w:r>
+        <w:t>• The user may choose which existing active computer to replace, identified by friendly name and last-used date.</w:t>
+      </w:r>
+    </w:p>
+    <w:p>
+      <w:r>
+        <w:t>• Replaced computers are not contacted and are not permanently deactivated.</w:t>
+      </w:r>
+    </w:p>
+    <w:p/>
+    <w:p>
+      <w:r>
+        <w:t>Failure and Fairness Guarantees</w:t>
+      </w:r>
+    </w:p>
+    <w:p>
+      <w:r>
+        <w:t>• JumpTo never disables itself solely due to being offline.</w:t>
+      </w:r>
+    </w:p>
+    <w:p>
+      <w:r>
+        <w:t>• Broken, retired, or reinstalled computers do not require manual deactivation.</w:t>
+      </w:r>
+    </w:p>
+    <w:p>
+      <w:r>
+        <w:t>• Licensing enforcement prioritizes low friction for honest users over absolute abuse prevention.</w:t>
       </w:r>
     </w:p>
     <w:sectPr>

</xml_diff>

<commit_message>
Latency Fixes: batch ORTS reads, cache global settings, remove migration code
Previously: buildDialogState made 5–6 sequential OfficeRuntime.storage.getItem
calls on every dialog open, plus ran legacy migration write logic that no longer
has any users to migrate.

- Replace serial getItem calls with a single getItems([...keys]) batch call
- Add module-level ortsSettingsCache: populated on first dialog open, reused
  for all subsequent opens in the same shared-runtime session
- Add invalidateOrtsSettingsCache(), called in all write paths (setGlobalUiSettings,
  setRowHeightPreset handler, selectSheet and cancel snapshot handlers)
- Delete migration write block entirely (no launched users, no legacy data to migrate)
- Syntax preflight confirmed: {} () [] balanced, no JSX in this file
</commit_message>
<xml_diff>
--- a/LPD.docx
+++ b/LPD.docx
@@ -707,7 +707,7 @@
           <w:sz w:val="22"/>
           <w:szCs w:val="22"/>
         </w:rPr>
-        <w:t xml:space="preserve">All patches are delivered as a single ZIP file with a JumpTo/ root folder. The folder tree inside mirrors the project structure (e.g. JumpTo/src/commands/commands.js). When the LPD is included, it sits at JumpTo/LPD.docx, a sibling of JumpTo/src/.</w:t>
+        <w:t xml:space="preserve">All patches are delivered as a single ZIP file. The normal root is src/ (e.g. src/commands/commands.js). When files outside src/ are included — such as LPD.docx — the root steps up to JumpTo/, so that all files sit correctly relative to each other (e.g. JumpTo/src/commands/commands.js and JumpTo/LPD.docx).</w:t>
       </w:r>
     </w:p>
     <w:p>
@@ -1515,7 +1515,7 @@
           <w:sz w:val="22"/>
           <w:szCs w:val="22"/>
         </w:rPr>
-        <w:t xml:space="preserve">Decision • All patches delivered as ZIP with JumpTo/ root folder. Rationale • Non-technical user needs a consistent, unambiguous drop-in structure; LPD sits alongside src/ so both can be included in a single archive without path confusion. Implications • Assistant must always zip output as JumpTo/... regardless of how many files are changed. Revisit Conditions • If project is restructured or a build system handles delivery automatically.</w:t>
+        <w:t xml:space="preserve">Decision • ZIP root is src/ by default; steps up to JumpTo/ only when files outside src/ are included. Rationale • src/ root is simpler and more natural for code-only patches; JumpTo/ root is only needed when LPD or other non-src files are part of the delivery. Implications • Assistant must assess each patch to determine the correct root before zipping. Revisit Conditions • If project is restructured or a build system handles delivery automatically.</w:t>
       </w:r>
     </w:p>
     <w:p>

</xml_diff>